<commit_message>
docs: incluir enlace de figma
</commit_message>
<xml_diff>
--- a/Entrega_2_Cancha_Central.docx
+++ b/Entrega_2_Cancha_Central.docx
@@ -593,6 +593,14 @@
       </w:pPr>
       <w:r>
         <w:t>Las siguientes pantallas corresponden a la propuesta visual utilizada como guía durante el desarrollo. La implementación funcional conserva la navegación, las tarjetas de noticias, los llamados a la acción y la identidad visual planteada en Figma.</w:t>
+      </w:r>
+    </w:p>
+    <w:p>
+      <w:pPr>
+        <w:spacing w:line="480" w:lineRule="auto" w:before="80" w:after="0"/>
+      </w:pPr>
+      <w:r>
+        <w:t>Diseño de Figma: https://www.figma.com/design/t0vgghM0RM6XpV8sWRljBA/Cancha-Central-%E2%80%94-Mockups?node-id=0-1</w:t>
       </w:r>
     </w:p>
     <w:p>

</xml_diff>

<commit_message>
docs: actualizar entrega 2 con imágenes locales
</commit_message>
<xml_diff>
--- a/Entrega_2_Cancha_Central.docx
+++ b/Entrega_2_Cancha_Central.docx
@@ -264,7 +264,7 @@
         <w:ind w:firstLine="720"/>
       </w:pPr>
       <w:r>
-        <w:t>El prototipo mantiene la identidad visual definida en la primera entrega: azul marino para la navegación y la información editorial, verde para acciones principales, amarillo como color de énfasis y marfil como fondo. El diseño responde a pantallas de computador y dispositivos móviles mediante media queries en CSS.</w:t>
+        <w:t>El prototipo mantiene la identidad visual definida en la primera entrega: azul marino para la navegación y la información editorial, verde para acciones principales, amarillo como color de énfasis y marfil como fondo. El diseño responde a pantallas de computador y dispositivos móviles mediante media queries en CSS. Las tarjetas emplean fotografías deportivas almacenadas localmente en la carpeta assets, por lo que la presentación visual no depende de una conexión a internet.</w:t>
       </w:r>
     </w:p>
     <w:p>
@@ -569,7 +569,7 @@
         <w:br/>
         <w:t>├── data/noticias.json</w:t>
         <w:br/>
-        <w:t>└── assets/noticia-*.svg</w:t>
+        <w:t>└── assets/futbol-*.jpg</w:t>
       </w:r>
     </w:p>
     <w:p>

</xml_diff>

<commit_message>
docs: ampliar anexo de código fuente
</commit_message>
<xml_diff>
--- a/Entrega_2_Cancha_Central.docx
+++ b/Entrega_2_Cancha_Central.docx
@@ -133,7 +133,15 @@
         <w:spacing w:line="480" w:lineRule="auto" w:before="120" w:after="0"/>
       </w:pPr>
       <w:r>
-        <w:t>Repositorio, conclusiones y referencias ......................... 11</w:t>
+        <w:t>Anexo de código fuente .............................................. 11</w:t>
+      </w:r>
+    </w:p>
+    <w:p>
+      <w:pPr>
+        <w:spacing w:line="480" w:lineRule="auto" w:before="120" w:after="0"/>
+      </w:pPr>
+      <w:r>
+        <w:t>Repositorio, conclusiones y referencias ......................... 14</w:t>
       </w:r>
     </w:p>
     <w:p>
@@ -1267,6 +1275,363 @@
         <w:spacing w:line="480" w:lineRule="auto" w:before="0" w:after="0"/>
       </w:pPr>
       <w:r>
+        <w:t>Anexo de código fuente</w:t>
+      </w:r>
+    </w:p>
+    <w:p>
+      <w:pPr>
+        <w:spacing w:line="480" w:lineRule="auto" w:before="0" w:after="0"/>
+      </w:pPr>
+      <w:r>
+        <w:t>Los siguientes extractos amplían la evidencia del desarrollo. Se presentan por responsabilidad para mostrar la organización entre estructura HTML, estilos CSS, datos JSON y lógica JavaScript.</w:t>
+      </w:r>
+    </w:p>
+    <w:p>
+      <w:pPr>
+        <w:pStyle w:val="Heading2"/>
+        <w:spacing w:line="480" w:lineRule="auto" w:before="200" w:after="0"/>
+      </w:pPr>
+      <w:r>
+        <w:t>Estructura de la página de inicio index.html</w:t>
+      </w:r>
+    </w:p>
+    <w:p>
+      <w:pPr>
+        <w:spacing w:after="140" w:line="240" w:lineRule="auto"/>
+        <w:ind w:left="432" w:right="360"/>
+        <w:shd w:fill="F2F4F5"/>
+      </w:pPr>
+      <w:r>
+        <w:rPr>
+          <w:rFonts w:ascii="Courier New" w:hAnsi="Courier New"/>
+          <w:color w:val="232D37"/>
+          <w:sz w:val="16"/>
+        </w:rPr>
+        <w:t>&lt;body data-page="home"&gt;</w:t>
+        <w:br/>
+        <w:t xml:space="preserve">  &lt;header class="site-header"&gt;&lt;/header&gt;</w:t>
+        <w:br/>
+        <w:t xml:space="preserve">  &lt;main id="contenido"&gt;</w:t>
+        <w:br/>
+        <w:t xml:space="preserve">    &lt;section class="hero"&gt; ... &lt;/section&gt;</w:t>
+        <w:br/>
+        <w:t xml:space="preserve">    &lt;div id="featured-news" class="cards cards--three"&gt;&lt;/div&gt;</w:t>
+        <w:br/>
+        <w:t xml:space="preserve">  &lt;/main&gt;</w:t>
+        <w:br/>
+        <w:t xml:space="preserve">  &lt;script src="js/app.js"&gt;&lt;/script&gt;</w:t>
+        <w:br/>
+        <w:t>&lt;/body&gt;</w:t>
+      </w:r>
+    </w:p>
+    <w:p>
+      <w:pPr>
+        <w:spacing w:line="480" w:lineRule="auto" w:before="0" w:after="0"/>
+      </w:pPr>
+      <w:r>
+        <w:t>El atributo data-page identifica la vista actual. JavaScript inserta el encabezado y el pie de página compartidos, lo que evita repetir el mismo código en cada archivo HTML.</w:t>
+      </w:r>
+    </w:p>
+    <w:p>
+      <w:pPr>
+        <w:pStyle w:val="Heading2"/>
+        <w:spacing w:line="480" w:lineRule="auto" w:before="200" w:after="0"/>
+      </w:pPr>
+      <w:r>
+        <w:t>Datos de noticias data/noticias.json</w:t>
+      </w:r>
+    </w:p>
+    <w:p>
+      <w:pPr>
+        <w:spacing w:after="140" w:line="240" w:lineRule="auto"/>
+        <w:ind w:left="432" w:right="360"/>
+        <w:shd w:fill="F2F4F5"/>
+      </w:pPr>
+      <w:r>
+        <w:rPr>
+          <w:rFonts w:ascii="Courier New" w:hAnsi="Courier New"/>
+          <w:color w:val="232D37"/>
+          <w:sz w:val="16"/>
+        </w:rPr>
+        <w:t>{</w:t>
+        <w:br/>
+        <w:t xml:space="preserve">  "id": 1,</w:t>
+        <w:br/>
+        <w:t xml:space="preserve">  "title": "La táctica que cambió la Liga BetPlay",</w:t>
+        <w:br/>
+        <w:t xml:space="preserve">  "category": "Fútbol colombiano",</w:t>
+        <w:br/>
+        <w:t xml:space="preserve">  "image": "assets/futbol-balón.jpg",</w:t>
+        <w:br/>
+        <w:t xml:space="preserve">  "description": "Análisis de la jornada..."</w:t>
+        <w:br/>
+        <w:t>}</w:t>
+      </w:r>
+    </w:p>
+    <w:p>
+      <w:r>
+        <w:br w:type="page"/>
+      </w:r>
+    </w:p>
+    <w:p>
+      <w:pPr>
+        <w:pStyle w:val="Heading1"/>
+        <w:spacing w:line="480" w:lineRule="auto" w:before="0" w:after="0"/>
+      </w:pPr>
+      <w:r>
+        <w:t>Anexo de código fuente</w:t>
+      </w:r>
+    </w:p>
+    <w:p>
+      <w:pPr>
+        <w:pStyle w:val="Heading2"/>
+        <w:spacing w:line="480" w:lineRule="auto" w:before="200" w:after="0"/>
+      </w:pPr>
+      <w:r>
+        <w:t>Estilos de tarjetas css/styles.css</w:t>
+      </w:r>
+    </w:p>
+    <w:p>
+      <w:pPr>
+        <w:spacing w:after="140" w:line="240" w:lineRule="auto"/>
+        <w:ind w:left="432" w:right="360"/>
+        <w:shd w:fill="F2F4F5"/>
+      </w:pPr>
+      <w:r>
+        <w:rPr>
+          <w:rFonts w:ascii="Courier New" w:hAnsi="Courier New"/>
+          <w:color w:val="232D37"/>
+          <w:sz w:val="16"/>
+        </w:rPr>
+        <w:t>.cards {</w:t>
+        <w:br/>
+        <w:t xml:space="preserve">  display: grid;</w:t>
+        <w:br/>
+        <w:t xml:space="preserve">  gap: 1.4rem;</w:t>
+        <w:br/>
+        <w:t>}</w:t>
+        <w:br/>
+        <w:t>.cards--three { grid-template-columns: repeat(3, 1fr); }</w:t>
+        <w:br/>
+        <w:t>.card {</w:t>
+        <w:br/>
+        <w:t xml:space="preserve">  background: #fff;</w:t>
+        <w:br/>
+        <w:t xml:space="preserve">  border: 1px solid var(--line);</w:t>
+        <w:br/>
+        <w:t xml:space="preserve">  border-radius: 15px;</w:t>
+        <w:br/>
+        <w:t xml:space="preserve">  overflow: hidden;</w:t>
+        <w:br/>
+        <w:t xml:space="preserve">  display: flex;</w:t>
+        <w:br/>
+        <w:t xml:space="preserve">  flex-direction: column;</w:t>
+        <w:br/>
+        <w:t>}</w:t>
+        <w:br/>
+        <w:t>.card img {</w:t>
+        <w:br/>
+        <w:t xml:space="preserve">  width: 100%; height: 170px;</w:t>
+        <w:br/>
+        <w:t xml:space="preserve">  object-fit: cover; object-position: center top;</w:t>
+        <w:br/>
+        <w:t>}</w:t>
+      </w:r>
+    </w:p>
+    <w:p>
+      <w:pPr>
+        <w:spacing w:line="480" w:lineRule="auto" w:before="0" w:after="0"/>
+      </w:pPr>
+      <w:r>
+        <w:t>La cuadrícula organiza las tarjetas en tres columnas en escritorio. Las reglas responsive cambian el número de columnas en pantallas pequeñas para conservar la legibilidad.</w:t>
+      </w:r>
+    </w:p>
+    <w:p>
+      <w:pPr>
+        <w:pStyle w:val="Heading2"/>
+        <w:spacing w:line="480" w:lineRule="auto" w:before="200" w:after="0"/>
+      </w:pPr>
+      <w:r>
+        <w:t>Carga de datos y generación de tarjetas js/app.js</w:t>
+      </w:r>
+    </w:p>
+    <w:p>
+      <w:pPr>
+        <w:spacing w:after="140" w:line="240" w:lineRule="auto"/>
+        <w:ind w:left="432" w:right="360"/>
+        <w:shd w:fill="F2F4F5"/>
+      </w:pPr>
+      <w:r>
+        <w:rPr>
+          <w:rFonts w:ascii="Courier New" w:hAnsi="Courier New"/>
+          <w:color w:val="232D37"/>
+          <w:sz w:val="16"/>
+        </w:rPr>
+        <w:t>async function init() {</w:t>
+        <w:br/>
+        <w:t xml:space="preserve">  renderLayout();</w:t>
+        <w:br/>
+        <w:t xml:space="preserve">  try {</w:t>
+        <w:br/>
+        <w:t xml:space="preserve">    baseNews = await fetch("data/noticias.json")</w:t>
+        <w:br/>
+        <w:t xml:space="preserve">      .then(response =&gt; response.json());</w:t>
+        <w:br/>
+        <w:t xml:space="preserve">  } catch {</w:t>
+        <w:br/>
+        <w:t xml:space="preserve">    // Se informa al usuario si el JSON no está disponible.</w:t>
+        <w:br/>
+        <w:t xml:space="preserve">    return;</w:t>
+        <w:br/>
+        <w:t xml:space="preserve">  }</w:t>
+        <w:br/>
+        <w:t xml:space="preserve">  const page = document.body.dataset.page;</w:t>
+        <w:br/>
+        <w:t xml:space="preserve">  const initPage = { home: initHome, news: initNews,</w:t>
+        <w:br/>
+        <w:t xml:space="preserve">    detail: initDetail, favorites: initFavorites,</w:t>
+        <w:br/>
+        <w:t xml:space="preserve">    contact: initContact, admin: initAdmin }[page];</w:t>
+        <w:br/>
+        <w:t xml:space="preserve">  if (initPage) initPage();</w:t>
+        <w:br/>
+        <w:t>}</w:t>
+        <w:br/>
+        <w:br/>
+        <w:t>function newsCard(item) {</w:t>
+        <w:br/>
+        <w:t xml:space="preserve">  return `&lt;article class="card"&gt; ... ${item.title} ... &lt;/article&gt;`;</w:t>
+        <w:br/>
+        <w:t>}</w:t>
+      </w:r>
+    </w:p>
+    <w:p>
+      <w:r>
+        <w:br w:type="page"/>
+      </w:r>
+    </w:p>
+    <w:p>
+      <w:pPr>
+        <w:pStyle w:val="Heading1"/>
+        <w:spacing w:line="480" w:lineRule="auto" w:before="0" w:after="0"/>
+      </w:pPr>
+      <w:r>
+        <w:t>Anexo de código fuente</w:t>
+      </w:r>
+    </w:p>
+    <w:p>
+      <w:pPr>
+        <w:pStyle w:val="Heading2"/>
+        <w:spacing w:line="480" w:lineRule="auto" w:before="200" w:after="0"/>
+      </w:pPr>
+      <w:r>
+        <w:t>Favoritos y almacenamiento local js/app.js</w:t>
+      </w:r>
+    </w:p>
+    <w:p>
+      <w:pPr>
+        <w:spacing w:after="140" w:line="240" w:lineRule="auto"/>
+        <w:ind w:left="432" w:right="360"/>
+        <w:shd w:fill="F2F4F5"/>
+      </w:pPr>
+      <w:r>
+        <w:rPr>
+          <w:rFonts w:ascii="Courier New" w:hAnsi="Courier New"/>
+          <w:color w:val="232D37"/>
+          <w:sz w:val="16"/>
+        </w:rPr>
+        <w:t>function favorites() {</w:t>
+        <w:br/>
+        <w:t xml:space="preserve">  return getLocal(KEYS.favorites, []);</w:t>
+        <w:br/>
+        <w:t>}</w:t>
+        <w:br/>
+        <w:br/>
+        <w:t>function toggleFavorite(id) {</w:t>
+        <w:br/>
+        <w:t xml:space="preserve">  const items = favorites();</w:t>
+        <w:br/>
+        <w:t xml:space="preserve">  const updated = items.includes(id)</w:t>
+        <w:br/>
+        <w:t xml:space="preserve">    ? items.filter(item =&gt; item !== id)</w:t>
+        <w:br/>
+        <w:t xml:space="preserve">    : [...items, id];</w:t>
+        <w:br/>
+        <w:t xml:space="preserve">  setLocal(KEYS.favorites, updated);</w:t>
+        <w:br/>
+        <w:t>}</w:t>
+      </w:r>
+    </w:p>
+    <w:p>
+      <w:pPr>
+        <w:spacing w:line="480" w:lineRule="auto" w:before="0" w:after="0"/>
+      </w:pPr>
+      <w:r>
+        <w:t>La función alterna el identificador de una noticia en localStorage. De esta manera, los favoritos se conservan cuando el usuario cambia de página o vuelve a abrir el sitio.</w:t>
+      </w:r>
+    </w:p>
+    <w:p>
+      <w:pPr>
+        <w:pStyle w:val="Heading2"/>
+        <w:spacing w:line="480" w:lineRule="auto" w:before="200" w:after="0"/>
+      </w:pPr>
+      <w:r>
+        <w:t>Validación del formulario y creación de noticias</w:t>
+      </w:r>
+    </w:p>
+    <w:p>
+      <w:pPr>
+        <w:spacing w:after="140" w:line="240" w:lineRule="auto"/>
+        <w:ind w:left="432" w:right="360"/>
+        <w:shd w:fill="F2F4F5"/>
+      </w:pPr>
+      <w:r>
+        <w:rPr>
+          <w:rFonts w:ascii="Courier New" w:hAnsi="Courier New"/>
+          <w:color w:val="232D37"/>
+          <w:sz w:val="16"/>
+        </w:rPr>
+        <w:t>form.addEventListener("submit", event =&gt; {</w:t>
+        <w:br/>
+        <w:t xml:space="preserve">  event.preventDefault();</w:t>
+        <w:br/>
+        <w:t xml:space="preserve">  const invalidEmail = !form.elements.email.validity.valid;</w:t>
+        <w:br/>
+        <w:t xml:space="preserve">  const shortMessage = form.elements.message.value.trim().length &lt; 10;</w:t>
+        <w:br/>
+        <w:t xml:space="preserve">  if (invalidEmail || shortMessage) return;</w:t>
+        <w:br/>
+        <w:t xml:space="preserve">  form.reset();</w:t>
+        <w:br/>
+        <w:t xml:space="preserve">  success.hidden = false;</w:t>
+        <w:br/>
+        <w:t>});</w:t>
+        <w:br/>
+        <w:br/>
+        <w:t>// El panel Administración crea una noticia y la guarda en localStorage.</w:t>
+        <w:br/>
+        <w:t>setLocal(KEYS.news, [item, ...getLocal(KEYS.news, [])]);</w:t>
+      </w:r>
+    </w:p>
+    <w:p>
+      <w:pPr>
+        <w:spacing w:line="480" w:lineRule="auto" w:before="0" w:after="0"/>
+      </w:pPr>
+      <w:r>
+        <w:t>Estos bloques corresponden al código fuente completo incluido en el repositorio. Los comentarios explican las decisiones de carga, persistencia, validación y creación de noticias.</w:t>
+      </w:r>
+    </w:p>
+    <w:p>
+      <w:r>
+        <w:br w:type="page"/>
+      </w:r>
+    </w:p>
+    <w:p>
+      <w:pPr>
+        <w:pStyle w:val="Heading1"/>
+        <w:spacing w:line="480" w:lineRule="auto" w:before="0" w:after="0"/>
+      </w:pPr>
+      <w:r>
         <w:t>Repositorio del proyecto</w:t>
       </w:r>
     </w:p>

</xml_diff>

<commit_message>
docs: reforzar evidencia de entrega dos
</commit_message>
<xml_diff>
--- a/Entrega_2_Cancha_Central.docx
+++ b/Entrega_2_Cancha_Central.docx
@@ -117,7 +117,7 @@
         <w:spacing w:line="480" w:lineRule="auto" w:before="120" w:after="0"/>
       </w:pPr>
       <w:r>
-        <w:t>Funcionalidades implementadas ..................................... 9</w:t>
+        <w:t>Correspondencia entre mockups y desarrollo .................... 9</w:t>
       </w:r>
     </w:p>
     <w:p>
@@ -125,7 +125,7 @@
         <w:spacing w:line="480" w:lineRule="auto" w:before="120" w:after="0"/>
       </w:pPr>
       <w:r>
-        <w:t>Fragmentos de código fuente ........................................ 10</w:t>
+        <w:t>Funcionalidades implementadas ................................... 10</w:t>
       </w:r>
     </w:p>
     <w:p>
@@ -133,7 +133,7 @@
         <w:spacing w:line="480" w:lineRule="auto" w:before="120" w:after="0"/>
       </w:pPr>
       <w:r>
-        <w:t>Anexo de código fuente .............................................. 11</w:t>
+        <w:t>Pruebas funcionales .................................................. 11</w:t>
       </w:r>
     </w:p>
     <w:p>
@@ -141,7 +141,23 @@
         <w:spacing w:line="480" w:lineRule="auto" w:before="120" w:after="0"/>
       </w:pPr>
       <w:r>
-        <w:t>Repositorio, conclusiones y referencias ......................... 14</w:t>
+        <w:t>Fragmentos de código fuente ...................................... 12</w:t>
+      </w:r>
+    </w:p>
+    <w:p>
+      <w:pPr>
+        <w:spacing w:line="480" w:lineRule="auto" w:before="120" w:after="0"/>
+      </w:pPr>
+      <w:r>
+        <w:t>Anexo de código fuente ............................................ 13</w:t>
+      </w:r>
+    </w:p>
+    <w:p>
+      <w:pPr>
+        <w:spacing w:line="480" w:lineRule="auto" w:before="120" w:after="0"/>
+      </w:pPr>
+      <w:r>
+        <w:t>Repositorio, conclusiones y referencias ....................... 16</w:t>
       </w:r>
     </w:p>
     <w:p>
@@ -842,6 +858,247 @@
         <w:spacing w:line="480" w:lineRule="auto" w:before="0" w:after="0"/>
       </w:pPr>
       <w:r>
+        <w:t>Correspondencia entre mockups y desarrollo</w:t>
+      </w:r>
+    </w:p>
+    <w:p>
+      <w:pPr>
+        <w:spacing w:line="480" w:lineRule="auto" w:before="0" w:after="0"/>
+      </w:pPr>
+      <w:r>
+        <w:t>La nota de entrega solicita conservar la relación entre la maquetación y el prototipo funcional. La siguiente matriz evidencia cómo se trasladaron al desarrollo los elementos centrales definidos en Figma.</w:t>
+      </w:r>
+    </w:p>
+    <w:tbl>
+      <w:tblPr>
+        <w:tblStyle w:val="TableGrid"/>
+        <w:tblW w:type="auto" w:w="0"/>
+        <w:tblLook w:firstColumn="1" w:firstRow="1" w:lastColumn="0" w:lastRow="0" w:noHBand="0" w:noVBand="1" w:val="04A0"/>
+      </w:tblPr>
+      <w:tblGrid>
+        <w:gridCol w:w="4680"/>
+        <w:gridCol w:w="4680"/>
+      </w:tblGrid>
+      <w:tr>
+        <w:tc>
+          <w:tcPr>
+            <w:tcW w:type="dxa" w:w="4680"/>
+            <w:vAlign w:val="center"/>
+          </w:tcPr>
+          <w:p>
+            <w:pPr>
+              <w:spacing w:line="264" w:lineRule="auto"/>
+            </w:pPr>
+            <w:r>
+              <w:rPr>
+                <w:rFonts w:ascii="Times New Roman" w:hAnsi="Times New Roman"/>
+                <w:b/>
+                <w:sz w:val="20"/>
+              </w:rPr>
+              <w:t>Elemento</w:t>
+            </w:r>
+          </w:p>
+        </w:tc>
+        <w:tc>
+          <w:tcPr>
+            <w:tcW w:type="dxa" w:w="4680"/>
+            <w:vAlign w:val="center"/>
+          </w:tcPr>
+          <w:p>
+            <w:pPr>
+              <w:spacing w:line="264" w:lineRule="auto"/>
+            </w:pPr>
+            <w:r>
+              <w:rPr>
+                <w:rFonts w:ascii="Times New Roman" w:hAnsi="Times New Roman"/>
+                <w:b/>
+                <w:sz w:val="20"/>
+              </w:rPr>
+              <w:t>Descripción</w:t>
+            </w:r>
+          </w:p>
+        </w:tc>
+      </w:tr>
+      <w:tr>
+        <w:tc>
+          <w:tcPr>
+            <w:tcW w:type="dxa" w:w="4680"/>
+            <w:vAlign w:val="center"/>
+          </w:tcPr>
+          <w:p>
+            <w:pPr>
+              <w:spacing w:line="264" w:lineRule="auto"/>
+            </w:pPr>
+            <w:r>
+              <w:rPr>
+                <w:rFonts w:ascii="Times New Roman" w:hAnsi="Times New Roman"/>
+                <w:b w:val="0"/>
+                <w:sz w:val="20"/>
+              </w:rPr>
+              <w:t>Home</w:t>
+            </w:r>
+          </w:p>
+        </w:tc>
+        <w:tc>
+          <w:tcPr>
+            <w:tcW w:type="dxa" w:w="4680"/>
+            <w:vAlign w:val="center"/>
+          </w:tcPr>
+          <w:p>
+            <w:pPr>
+              <w:spacing w:line="264" w:lineRule="auto"/>
+            </w:pPr>
+            <w:r>
+              <w:rPr>
+                <w:rFonts w:ascii="Times New Roman" w:hAnsi="Times New Roman"/>
+                <w:b w:val="0"/>
+                <w:sz w:val="20"/>
+              </w:rPr>
+              <w:t>Se conservan el encabezado, sección de bienvenida, llamadas a la acción, noticias destacadas y pie de página.</w:t>
+            </w:r>
+          </w:p>
+        </w:tc>
+      </w:tr>
+      <w:tr>
+        <w:tc>
+          <w:tcPr>
+            <w:tcW w:type="dxa" w:w="4680"/>
+            <w:vAlign w:val="center"/>
+          </w:tcPr>
+          <w:p>
+            <w:pPr>
+              <w:spacing w:line="264" w:lineRule="auto"/>
+            </w:pPr>
+            <w:r>
+              <w:rPr>
+                <w:rFonts w:ascii="Times New Roman" w:hAnsi="Times New Roman"/>
+                <w:b w:val="0"/>
+                <w:sz w:val="20"/>
+              </w:rPr>
+              <w:t>Listado</w:t>
+            </w:r>
+          </w:p>
+        </w:tc>
+        <w:tc>
+          <w:tcPr>
+            <w:tcW w:type="dxa" w:w="4680"/>
+            <w:vAlign w:val="center"/>
+          </w:tcPr>
+          <w:p>
+            <w:pPr>
+              <w:spacing w:line="264" w:lineRule="auto"/>
+            </w:pPr>
+            <w:r>
+              <w:rPr>
+                <w:rFonts w:ascii="Times New Roman" w:hAnsi="Times New Roman"/>
+                <w:b w:val="0"/>
+                <w:sz w:val="20"/>
+              </w:rPr>
+              <w:t>El catálogo mantiene tarjetas con imagen, categoría, título, descripción breve y enlace. Se añadieron búsqueda y filtros.</w:t>
+            </w:r>
+          </w:p>
+        </w:tc>
+      </w:tr>
+      <w:tr>
+        <w:tc>
+          <w:tcPr>
+            <w:tcW w:type="dxa" w:w="4680"/>
+            <w:vAlign w:val="center"/>
+          </w:tcPr>
+          <w:p>
+            <w:pPr>
+              <w:spacing w:line="264" w:lineRule="auto"/>
+            </w:pPr>
+            <w:r>
+              <w:rPr>
+                <w:rFonts w:ascii="Times New Roman" w:hAnsi="Times New Roman"/>
+                <w:b w:val="0"/>
+                <w:sz w:val="20"/>
+              </w:rPr>
+              <w:t>Detalle</w:t>
+            </w:r>
+          </w:p>
+        </w:tc>
+        <w:tc>
+          <w:tcPr>
+            <w:tcW w:type="dxa" w:w="4680"/>
+            <w:vAlign w:val="center"/>
+          </w:tcPr>
+          <w:p>
+            <w:pPr>
+              <w:spacing w:line="264" w:lineRule="auto"/>
+            </w:pPr>
+            <w:r>
+              <w:rPr>
+                <w:rFonts w:ascii="Times New Roman" w:hAnsi="Times New Roman"/>
+                <w:b w:val="0"/>
+                <w:sz w:val="20"/>
+              </w:rPr>
+              <w:t>La vista conserva la jerarquía de título, imagen, información editorial y acción para agregar a favoritos.</w:t>
+            </w:r>
+          </w:p>
+        </w:tc>
+      </w:tr>
+      <w:tr>
+        <w:tc>
+          <w:tcPr>
+            <w:tcW w:type="dxa" w:w="4680"/>
+            <w:vAlign w:val="center"/>
+          </w:tcPr>
+          <w:p>
+            <w:pPr>
+              <w:spacing w:line="264" w:lineRule="auto"/>
+            </w:pPr>
+            <w:r>
+              <w:rPr>
+                <w:rFonts w:ascii="Times New Roman" w:hAnsi="Times New Roman"/>
+                <w:b w:val="0"/>
+                <w:sz w:val="20"/>
+              </w:rPr>
+              <w:t>Contacto</w:t>
+            </w:r>
+          </w:p>
+        </w:tc>
+        <w:tc>
+          <w:tcPr>
+            <w:tcW w:type="dxa" w:w="4680"/>
+            <w:vAlign w:val="center"/>
+          </w:tcPr>
+          <w:p>
+            <w:pPr>
+              <w:spacing w:line="264" w:lineRule="auto"/>
+            </w:pPr>
+            <w:r>
+              <w:rPr>
+                <w:rFonts w:ascii="Times New Roman" w:hAnsi="Times New Roman"/>
+                <w:b w:val="0"/>
+                <w:sz w:val="20"/>
+              </w:rPr>
+              <w:t>Se conserva la composición de información editorial y formulario; se implementaron validaciones y confirmación de envío.</w:t>
+            </w:r>
+          </w:p>
+        </w:tc>
+      </w:tr>
+    </w:tbl>
+    <w:p>
+      <w:pPr>
+        <w:spacing w:line="480" w:lineRule="auto" w:before="200" w:after="0"/>
+      </w:pPr>
+      <w:r>
+        <w:t>Las pantallas de Favoritos y Administración amplían la propuesta inicial para cubrir la interacción persistente y el mini CRUD solicitados en la Entrega 2.</w:t>
+      </w:r>
+    </w:p>
+    <w:p>
+      <w:r>
+        <w:br w:type="page"/>
+      </w:r>
+    </w:p>
+    <w:p>
+      <w:pPr>
+        <w:pStyle w:val="Heading1"/>
+        <w:spacing w:line="480" w:lineRule="auto" w:before="0" w:after="0"/>
+      </w:pPr>
+      <w:r>
         <w:t>Funcionalidades implementadas</w:t>
       </w:r>
     </w:p>
@@ -1143,6 +1400,327 @@
       </w:pPr>
       <w:r>
         <w:t>La interfaz incluye un menú de seis páginas, un pie de página uniforme y adaptación responsive. La estructura se diseñó para que el código pueda evolucionar a componentes de Angular en la siguiente entrega.</w:t>
+      </w:r>
+    </w:p>
+    <w:p>
+      <w:r>
+        <w:br w:type="page"/>
+      </w:r>
+    </w:p>
+    <w:p>
+      <w:pPr>
+        <w:pStyle w:val="Heading1"/>
+        <w:spacing w:line="480" w:lineRule="auto" w:before="0" w:after="0"/>
+      </w:pPr>
+      <w:r>
+        <w:t>Pruebas funcionales</w:t>
+      </w:r>
+    </w:p>
+    <w:p>
+      <w:pPr>
+        <w:spacing w:line="480" w:lineRule="auto" w:before="0" w:after="0"/>
+      </w:pPr>
+      <w:r>
+        <w:t>Se realizaron pruebas manuales en navegador usando el flujo principal de cada pantalla. Los resultados permiten comprobar el comportamiento solicitado sin requerir un servidor de base de datos.</w:t>
+      </w:r>
+    </w:p>
+    <w:tbl>
+      <w:tblPr>
+        <w:tblStyle w:val="TableGrid"/>
+        <w:tblW w:type="auto" w:w="0"/>
+        <w:tblLook w:firstColumn="1" w:firstRow="1" w:lastColumn="0" w:lastRow="0" w:noHBand="0" w:noVBand="1" w:val="04A0"/>
+      </w:tblPr>
+      <w:tblGrid>
+        <w:gridCol w:w="4680"/>
+        <w:gridCol w:w="4680"/>
+      </w:tblGrid>
+      <w:tr>
+        <w:tc>
+          <w:tcPr>
+            <w:tcW w:type="dxa" w:w="4680"/>
+            <w:vAlign w:val="center"/>
+          </w:tcPr>
+          <w:p>
+            <w:pPr>
+              <w:spacing w:line="264" w:lineRule="auto"/>
+            </w:pPr>
+            <w:r>
+              <w:rPr>
+                <w:rFonts w:ascii="Times New Roman" w:hAnsi="Times New Roman"/>
+                <w:b/>
+                <w:sz w:val="20"/>
+              </w:rPr>
+              <w:t>Elemento</w:t>
+            </w:r>
+          </w:p>
+        </w:tc>
+        <w:tc>
+          <w:tcPr>
+            <w:tcW w:type="dxa" w:w="4680"/>
+            <w:vAlign w:val="center"/>
+          </w:tcPr>
+          <w:p>
+            <w:pPr>
+              <w:spacing w:line="264" w:lineRule="auto"/>
+            </w:pPr>
+            <w:r>
+              <w:rPr>
+                <w:rFonts w:ascii="Times New Roman" w:hAnsi="Times New Roman"/>
+                <w:b/>
+                <w:sz w:val="20"/>
+              </w:rPr>
+              <w:t>Descripción</w:t>
+            </w:r>
+          </w:p>
+        </w:tc>
+      </w:tr>
+      <w:tr>
+        <w:tc>
+          <w:tcPr>
+            <w:tcW w:type="dxa" w:w="4680"/>
+            <w:vAlign w:val="center"/>
+          </w:tcPr>
+          <w:p>
+            <w:pPr>
+              <w:spacing w:line="264" w:lineRule="auto"/>
+            </w:pPr>
+            <w:r>
+              <w:rPr>
+                <w:rFonts w:ascii="Times New Roman" w:hAnsi="Times New Roman"/>
+                <w:b w:val="0"/>
+                <w:sz w:val="20"/>
+              </w:rPr>
+              <w:t>Carga desde JSON</w:t>
+            </w:r>
+          </w:p>
+        </w:tc>
+        <w:tc>
+          <w:tcPr>
+            <w:tcW w:type="dxa" w:w="4680"/>
+            <w:vAlign w:val="center"/>
+          </w:tcPr>
+          <w:p>
+            <w:pPr>
+              <w:spacing w:line="264" w:lineRule="auto"/>
+            </w:pPr>
+            <w:r>
+              <w:rPr>
+                <w:rFonts w:ascii="Times New Roman" w:hAnsi="Times New Roman"/>
+                <w:b w:val="0"/>
+                <w:sz w:val="20"/>
+              </w:rPr>
+              <w:t>Al abrir Inicio o Noticias se generan tarjetas a partir de data/noticias.json. Resultado: correcto.</w:t>
+            </w:r>
+          </w:p>
+        </w:tc>
+      </w:tr>
+      <w:tr>
+        <w:tc>
+          <w:tcPr>
+            <w:tcW w:type="dxa" w:w="4680"/>
+            <w:vAlign w:val="center"/>
+          </w:tcPr>
+          <w:p>
+            <w:pPr>
+              <w:spacing w:line="264" w:lineRule="auto"/>
+            </w:pPr>
+            <w:r>
+              <w:rPr>
+                <w:rFonts w:ascii="Times New Roman" w:hAnsi="Times New Roman"/>
+                <w:b w:val="0"/>
+                <w:sz w:val="20"/>
+              </w:rPr>
+              <w:t>Búsqueda y filtro</w:t>
+            </w:r>
+          </w:p>
+        </w:tc>
+        <w:tc>
+          <w:tcPr>
+            <w:tcW w:type="dxa" w:w="4680"/>
+            <w:vAlign w:val="center"/>
+          </w:tcPr>
+          <w:p>
+            <w:pPr>
+              <w:spacing w:line="264" w:lineRule="auto"/>
+            </w:pPr>
+            <w:r>
+              <w:rPr>
+                <w:rFonts w:ascii="Times New Roman" w:hAnsi="Times New Roman"/>
+                <w:b w:val="0"/>
+                <w:sz w:val="20"/>
+              </w:rPr>
+              <w:t>Se consultaron términos y categorías; el contador y las tarjetas se actualizan sin recargar. Resultado: correcto.</w:t>
+            </w:r>
+          </w:p>
+        </w:tc>
+      </w:tr>
+      <w:tr>
+        <w:tc>
+          <w:tcPr>
+            <w:tcW w:type="dxa" w:w="4680"/>
+            <w:vAlign w:val="center"/>
+          </w:tcPr>
+          <w:p>
+            <w:pPr>
+              <w:spacing w:line="264" w:lineRule="auto"/>
+            </w:pPr>
+            <w:r>
+              <w:rPr>
+                <w:rFonts w:ascii="Times New Roman" w:hAnsi="Times New Roman"/>
+                <w:b w:val="0"/>
+                <w:sz w:val="20"/>
+              </w:rPr>
+              <w:t>Favoritos</w:t>
+            </w:r>
+          </w:p>
+        </w:tc>
+        <w:tc>
+          <w:tcPr>
+            <w:tcW w:type="dxa" w:w="4680"/>
+            <w:vAlign w:val="center"/>
+          </w:tcPr>
+          <w:p>
+            <w:pPr>
+              <w:spacing w:line="264" w:lineRule="auto"/>
+            </w:pPr>
+            <w:r>
+              <w:rPr>
+                <w:rFonts w:ascii="Times New Roman" w:hAnsi="Times New Roman"/>
+                <w:b w:val="0"/>
+                <w:sz w:val="20"/>
+              </w:rPr>
+              <w:t>Se agregó una noticia, se navegó a otra página y se verificó su permanencia al volver. Resultado: correcto.</w:t>
+            </w:r>
+          </w:p>
+        </w:tc>
+      </w:tr>
+      <w:tr>
+        <w:tc>
+          <w:tcPr>
+            <w:tcW w:type="dxa" w:w="4680"/>
+            <w:vAlign w:val="center"/>
+          </w:tcPr>
+          <w:p>
+            <w:pPr>
+              <w:spacing w:line="264" w:lineRule="auto"/>
+            </w:pPr>
+            <w:r>
+              <w:rPr>
+                <w:rFonts w:ascii="Times New Roman" w:hAnsi="Times New Roman"/>
+                <w:b w:val="0"/>
+                <w:sz w:val="20"/>
+              </w:rPr>
+              <w:t>Formulario</w:t>
+            </w:r>
+          </w:p>
+        </w:tc>
+        <w:tc>
+          <w:tcPr>
+            <w:tcW w:type="dxa" w:w="4680"/>
+            <w:vAlign w:val="center"/>
+          </w:tcPr>
+          <w:p>
+            <w:pPr>
+              <w:spacing w:line="264" w:lineRule="auto"/>
+            </w:pPr>
+            <w:r>
+              <w:rPr>
+                <w:rFonts w:ascii="Times New Roman" w:hAnsi="Times New Roman"/>
+                <w:b w:val="0"/>
+                <w:sz w:val="20"/>
+              </w:rPr>
+              <w:t>Se intentó enviar campos vacíos, correo inválido y mensaje corto; se mostraron errores. Con datos válidos aparece confirmación. Resultado: correcto.</w:t>
+            </w:r>
+          </w:p>
+        </w:tc>
+      </w:tr>
+      <w:tr>
+        <w:tc>
+          <w:tcPr>
+            <w:tcW w:type="dxa" w:w="4680"/>
+            <w:vAlign w:val="center"/>
+          </w:tcPr>
+          <w:p>
+            <w:pPr>
+              <w:spacing w:line="264" w:lineRule="auto"/>
+            </w:pPr>
+            <w:r>
+              <w:rPr>
+                <w:rFonts w:ascii="Times New Roman" w:hAnsi="Times New Roman"/>
+                <w:b w:val="0"/>
+                <w:sz w:val="20"/>
+              </w:rPr>
+              <w:t>Crear noticia</w:t>
+            </w:r>
+          </w:p>
+        </w:tc>
+        <w:tc>
+          <w:tcPr>
+            <w:tcW w:type="dxa" w:w="4680"/>
+            <w:vAlign w:val="center"/>
+          </w:tcPr>
+          <w:p>
+            <w:pPr>
+              <w:spacing w:line="264" w:lineRule="auto"/>
+            </w:pPr>
+            <w:r>
+              <w:rPr>
+                <w:rFonts w:ascii="Times New Roman" w:hAnsi="Times New Roman"/>
+                <w:b w:val="0"/>
+                <w:sz w:val="20"/>
+              </w:rPr>
+              <w:t>Desde Administración se registró una noticia válida y apareció en el panel y el catálogo. Resultado: correcto.</w:t>
+            </w:r>
+          </w:p>
+        </w:tc>
+      </w:tr>
+      <w:tr>
+        <w:tc>
+          <w:tcPr>
+            <w:tcW w:type="dxa" w:w="4680"/>
+            <w:vAlign w:val="center"/>
+          </w:tcPr>
+          <w:p>
+            <w:pPr>
+              <w:spacing w:line="264" w:lineRule="auto"/>
+            </w:pPr>
+            <w:r>
+              <w:rPr>
+                <w:rFonts w:ascii="Times New Roman" w:hAnsi="Times New Roman"/>
+                <w:b w:val="0"/>
+                <w:sz w:val="20"/>
+              </w:rPr>
+              <w:t>Eliminar noticia</w:t>
+            </w:r>
+          </w:p>
+        </w:tc>
+        <w:tc>
+          <w:tcPr>
+            <w:tcW w:type="dxa" w:w="4680"/>
+            <w:vAlign w:val="center"/>
+          </w:tcPr>
+          <w:p>
+            <w:pPr>
+              <w:spacing w:line="264" w:lineRule="auto"/>
+            </w:pPr>
+            <w:r>
+              <w:rPr>
+                <w:rFonts w:ascii="Times New Roman" w:hAnsi="Times New Roman"/>
+                <w:b w:val="0"/>
+                <w:sz w:val="20"/>
+              </w:rPr>
+              <w:t>Se eliminó una publicación creada; se retiró del panel y de favoritos, si estaba guardada. Resultado: correcto.</w:t>
+            </w:r>
+          </w:p>
+        </w:tc>
+      </w:tr>
+    </w:tbl>
+    <w:p>
+      <w:pPr>
+        <w:spacing w:line="480" w:lineRule="auto" w:before="200" w:after="0"/>
+      </w:pPr>
+      <w:r>
+        <w:t>Estas verificaciones demuestran el uso integrado de HTML, CSS y JavaScript, así como la persistencia local requerida para esta fase del proyecto.</w:t>
       </w:r>
     </w:p>
     <w:p>

</xml_diff>